<commit_message>
chore: record daily YouTube research execution state
</commit_message>
<xml_diff>
--- a/reports/2026-10-08/YouTube_AI趨勢研究雷達_2026-10-08_完整報告.docx
+++ b/reports/2026-10-08/YouTube_AI趨勢研究雷達_2026-10-08_完整報告.docx
@@ -12,7 +12,7 @@
     </w:p>
     <w:p>
       <w:r>
-        <w:t>自動產出時間：2026-10-08T01:35:03.959703+00:00 | 資料來源：YouTube Research MCP | 近72h去重樣本：40</w:t>
+        <w:t>自動產出時間：2026-10-08T02:40:18.877507+00:00 | 資料來源：YouTube Research MCP | 近72h去重樣本：40</w:t>
       </w:r>
     </w:p>
     <w:p>
@@ -38,49 +38,49 @@
     </w:p>
     <w:p>
       <w:r>
-        <w:t>1. The NEW AI Side Hustle That's Making People RICH｜Wholesale Ted｜47,446 views｜2026-10-05T19:11:23Z</w:t>
+        <w:t>1. The NEW AI Side Hustle That's Making People RICH｜Wholesale Ted｜47,636 views｜2026-10-05T19:11:23Z</w:t>
         <w:br/>
         <w:t>https://www.youtube.com/watch?v=CXf_UsxGrfg</w:t>
       </w:r>
     </w:p>
     <w:p>
       <w:r>
-        <w:t>2. 【新刊】AIに9割任せる株式投資は本当に使える？ChatGPT・Claudeで実際に検証してみた｜聞いてわかる投資本チャンネル｜29,972 views｜2026-10-06T11:00:25Z</w:t>
+        <w:t>2. 【新刊】AIに9割任せる株式投資は本当に使える？ChatGPT・Claudeで実際に検証してみた｜聞いてわかる投資本チャンネル｜30,306 views｜2026-10-06T11:00:25Z</w:t>
         <w:br/>
         <w:t>https://www.youtube.com/watch?v=cxJsqDOkGTs</w:t>
       </w:r>
     </w:p>
     <w:p>
       <w:r>
-        <w:t>3. 【検証】AIでTikTok完全自動化｜3週間やって分かった「ガチむずい理由」｜ガチ検証 | シズマ｜24,965 views｜2026-10-05T11:00:39Z</w:t>
+        <w:t>3. 【検証】AIでTikTok完全自動化｜3週間やって分かった「ガチむずい理由」｜ガチ検証 | シズマ｜25,064 views｜2026-10-05T11:00:39Z</w:t>
         <w:br/>
         <w:t>https://www.youtube.com/watch?v=AgSSLBxNvW8</w:t>
       </w:r>
     </w:p>
     <w:p>
       <w:r>
-        <w:t>4. 【絶対やるな】AIで作った3Dモデルを副業販売するときの落とし穴！企業に負けない個人事業の戦略を徹底解説！ #3Dプリンター #a1mini #3D生成AI｜Age of 3DP / ウノケン【3Dプリンター】｜11,060 views｜2026-10-07T10:00:07Z</w:t>
+        <w:t>4. 【絶対やるな】AIで作った3Dモデルを副業販売するときの落とし穴！企業に負けない個人事業の戦略を徹底解説！ #3Dプリンター #a1mini #3D生成AI｜Age of 3DP / ウノケン【3Dプリンター】｜11,504 views｜2026-10-07T10:00:07Z</w:t>
         <w:br/>
         <w:t>https://www.youtube.com/watch?v=7l4Qfz14bfs</w:t>
       </w:r>
     </w:p>
     <w:p>
       <w:r>
-        <w:t>5. 5 Boring Claude AI Side Hustles That Pay Better Than a 9-5｜Sean Dollwet｜9,266 views｜2026-10-07T12:00:37Z</w:t>
+        <w:t>5. 5 Boring Claude AI Side Hustles That Pay Better Than a 9-5｜Sean Dollwet｜9,630 views｜2026-10-07T12:00:37Z</w:t>
         <w:br/>
         <w:t>https://www.youtube.com/watch?v=FZRqKUWtTvw</w:t>
       </w:r>
     </w:p>
     <w:p>
       <w:r>
-        <w:t>6. 鴻海下一張王牌是機器人？AI伺服器營收狂飆　德州廠導入自動化「機器人反過來造AI」｜關我什麼事｜94要賺錢｜94要賺錢｜8,170 views｜2026-10-07T07:00:11Z</w:t>
+        <w:t>6. 鴻海下一張王牌是機器人？AI伺服器營收狂飆　德州廠導入自動化「機器人反過來造AI」｜關我什麼事｜94要賺錢｜94要賺錢｜8,431 views｜2026-10-07T07:00:11Z</w:t>
         <w:br/>
         <w:t>https://www.youtube.com/watch?v=JtNupdfBZoA</w:t>
       </w:r>
     </w:p>
     <w:p>
       <w:r>
-        <w:t>7. AIで稼ぐ人は、結局どんな仕事をしている？年商30億社長が今すすめる副業を本音で解説｜みかみ【東大退学させられた男】｜8,078 views｜2026-10-05T13:41:07Z</w:t>
+        <w:t>7. AIで稼ぐ人は、結局どんな仕事をしている？年商30億社長が今すすめる副業を本音で解説｜みかみ【東大退学させられた男】｜8,050 views｜2026-10-05T13:41:07Z</w:t>
         <w:br/>
         <w:t>https://www.youtube.com/watch?v=fvWnEmN3F-Q</w:t>
       </w:r>
@@ -101,7 +101,7 @@
     </w:p>
     <w:p>
       <w:r>
-        <w:t>10. 不露臉、不拍片，7 天就開始賺錢｜最懶的 AI 賺錢法｜堆金積玉｜3,748 views｜2026-10-07T11:00:17Z</w:t>
+        <w:t>10. 不露臉、不拍片，7 天就開始賺錢｜最懶的 AI 賺錢法｜堆金積玉｜3,955 views｜2026-10-07T11:00:17Z</w:t>
         <w:br/>
         <w:t>https://www.youtube.com/watch?v=FI1zyFt1xpU</w:t>
       </w:r>
@@ -238,7 +238,7 @@
     </w:p>
     <w:p>
       <w:r>
-        <w:t>5 Boring Claude AI Side Hustles That Pay Better Than a 9-5｜實際取得留言 8 則</w:t>
+        <w:t>5 Boring Claude AI Side Hustles That Pay Better Than a 9-5｜實際取得留言 9 則</w:t>
       </w:r>
     </w:p>
     <w:p>

</xml_diff>